<commit_message>
Mark EOS as confirmed: EOS GmbH, the 3D printing company
Co-Authored-By: Claude Opus 5.5 <noreply@anthropic.com>
Claude-Session: https://claude.ai/code/session_011Vvxd2V3zerAfjn84yXuuv
</commit_message>
<xml_diff>
--- a/call-scripts/EOS-F1-Intro-Call-Script.docx
+++ b/call-scripts/EOS-F1-Intro-Call-Script.docx
@@ -41,10 +41,10 @@
           <w:b/>
           <w:bCs/>
         </w:rPr>
-        <w:t xml:space="preserve">Which EOS (confirm):</w:t>
-      </w:r>
-      <w:r>
-        <w:t xml:space="preserve"> written for EOS GmbH (eos.info), the family-owned industrial 3D printing company in Krailling near Munich. It's the only EOS in Rahul's files: number 5 on the Machine Tools list in "templates for week of 26th Nov". No other EOS (Eos Energy, EOS Worldwide, Electro Optic Systems and so on) appears in any prospect list or "Emails Ready" doc.</w:t>
+        <w:t xml:space="preserve">Which EOS (confirmed by Rahul, 30 October):</w:t>
+      </w:r>
+      <w:r>
+        <w:t xml:space="preserve"> EOS GmbH (eos.info), the family-owned industrial 3D printing company in Krailling near Munich.</w:t>
       </w:r>
     </w:p>
     <w:p>

</xml_diff>